<commit_message>
Documentation updated to include docker MySQL.
</commit_message>
<xml_diff>
--- a/docs/religious-texts-technical.docx
+++ b/docs/religious-texts-technical.docx
@@ -118,7 +118,7 @@
           <w:sz w:val="26"/>
           <w:szCs w:val="26"/>
         </w:rPr>
-        <w:t xml:space="preserve">1.1 Technology Stack</w:t>
+        <w:t xml:space="preserve">1.2 Technology Stack</w:t>
       </w:r>
     </w:p>
     <w:tbl>
@@ -359,7 +359,7 @@
                 <w:sz w:val="20"/>
                 <w:szCs w:val="20"/>
               </w:rPr>
-              <w:t xml:space="preserve">Database</w:t>
+              <w:t xml:space="preserve">Text database</w:t>
             </w:r>
           </w:p>
         </w:tc>
@@ -389,7 +389,7 @@
                 <w:sz w:val="20"/>
                 <w:szCs w:val="20"/>
               </w:rPr>
-              <w:t xml:space="preserve">BaseX 10 (native XML database)</w:t>
+              <w:t xml:space="preserve">BaseX 10 (native XML database) — port 8984</w:t>
             </w:r>
           </w:p>
         </w:tc>
@@ -423,7 +423,7 @@
                 <w:sz w:val="20"/>
                 <w:szCs w:val="20"/>
               </w:rPr>
-              <w:t xml:space="preserve">Build</w:t>
+              <w:t xml:space="preserve">User database</w:t>
             </w:r>
           </w:p>
         </w:tc>
@@ -453,7 +453,7 @@
                 <w:sz w:val="20"/>
                 <w:szCs w:val="20"/>
               </w:rPr>
-              <w:t xml:space="preserve">Maven (multi-module)</w:t>
+              <w:t xml:space="preserve">MySQL 8.3 (users, comments, notes) — port 3306</w:t>
             </w:r>
           </w:p>
         </w:tc>
@@ -487,7 +487,7 @@
                 <w:sz w:val="20"/>
                 <w:szCs w:val="20"/>
               </w:rPr>
-              <w:t xml:space="preserve">Data ingestion</w:t>
+              <w:t xml:space="preserve">Build</w:t>
             </w:r>
           </w:p>
         </w:tc>
@@ -517,7 +517,7 @@
                 <w:sz w:val="20"/>
                 <w:szCs w:val="20"/>
               </w:rPr>
-              <w:t xml:space="preserve">Spring Boot service on port 8091</w:t>
+              <w:t xml:space="preserve">Maven (multi-module)</w:t>
             </w:r>
           </w:p>
         </w:tc>
@@ -551,7 +551,7 @@
                 <w:sz w:val="20"/>
                 <w:szCs w:val="20"/>
               </w:rPr>
-              <w:t xml:space="preserve">App server</w:t>
+              <w:t xml:space="preserve">Data ingestion</w:t>
             </w:r>
           </w:p>
         </w:tc>
@@ -581,7 +581,7 @@
                 <w:sz w:val="20"/>
                 <w:szCs w:val="20"/>
               </w:rPr>
-              <w:t xml:space="preserve">Embedded Tomcat on port 8090</w:t>
+              <w:t xml:space="preserve">Spring Boot service on port 8091</w:t>
             </w:r>
           </w:p>
         </w:tc>
@@ -615,6 +615,134 @@
                 <w:sz w:val="20"/>
                 <w:szCs w:val="20"/>
               </w:rPr>
+              <w:t xml:space="preserve">App server</w:t>
+            </w:r>
+          </w:p>
+        </w:tc>
+        <w:tc>
+          <w:tcPr>
+            <w:tcBorders>
+              <w:top w:val="single" w:color="CCCCCC" w:sz="1"/>
+              <w:left w:val="single" w:color="CCCCCC" w:sz="1"/>
+              <w:bottom w:val="single" w:color="CCCCCC" w:sz="1"/>
+              <w:right w:val="single" w:color="CCCCCC" w:sz="1"/>
+            </w:tcBorders>
+            <w:shd w:fill="f5f8fb" w:val="clear"/>
+            <w:tcMar>
+              <w:top w:type="dxa" w:w="80"/>
+              <w:left w:type="dxa" w:w="120"/>
+              <w:bottom w:type="dxa" w:w="80"/>
+              <w:right w:type="dxa" w:w="120"/>
+            </w:tcMar>
+          </w:tcPr>
+          <w:p>
+            <w:r>
+              <w:rPr>
+                <w:rFonts w:ascii="Arial" w:cs="Arial" w:eastAsia="Arial" w:hAnsi="Arial"/>
+                <w:b w:val="false"/>
+                <w:bCs w:val="false"/>
+                <w:color w:val="333333"/>
+                <w:sz w:val="20"/>
+                <w:szCs w:val="20"/>
+              </w:rPr>
+              <w:t xml:space="preserve">Embedded Tomcat on port 8090</w:t>
+            </w:r>
+          </w:p>
+        </w:tc>
+      </w:tr>
+      <w:tr>
+        <w:trPr>
+          <w:tblHeader w:val="false"/>
+        </w:trPr>
+        <w:tc>
+          <w:tcPr>
+            <w:tcBorders>
+              <w:top w:val="single" w:color="CCCCCC" w:sz="1"/>
+              <w:left w:val="single" w:color="CCCCCC" w:sz="1"/>
+              <w:bottom w:val="single" w:color="CCCCCC" w:sz="1"/>
+              <w:right w:val="single" w:color="CCCCCC" w:sz="1"/>
+            </w:tcBorders>
+            <w:tcMar>
+              <w:top w:type="dxa" w:w="80"/>
+              <w:left w:type="dxa" w:w="120"/>
+              <w:bottom w:type="dxa" w:w="80"/>
+              <w:right w:type="dxa" w:w="120"/>
+            </w:tcMar>
+          </w:tcPr>
+          <w:p>
+            <w:r>
+              <w:rPr>
+                <w:rFonts w:ascii="Arial" w:cs="Arial" w:eastAsia="Arial" w:hAnsi="Arial"/>
+                <w:b w:val="false"/>
+                <w:bCs w:val="false"/>
+                <w:color w:val="333333"/>
+                <w:sz w:val="20"/>
+                <w:szCs w:val="20"/>
+              </w:rPr>
+              <w:t xml:space="preserve">Container</w:t>
+            </w:r>
+          </w:p>
+        </w:tc>
+        <w:tc>
+          <w:tcPr>
+            <w:tcBorders>
+              <w:top w:val="single" w:color="CCCCCC" w:sz="1"/>
+              <w:left w:val="single" w:color="CCCCCC" w:sz="1"/>
+              <w:bottom w:val="single" w:color="CCCCCC" w:sz="1"/>
+              <w:right w:val="single" w:color="CCCCCC" w:sz="1"/>
+            </w:tcBorders>
+            <w:shd w:fill="f5f8fb" w:val="clear"/>
+            <w:tcMar>
+              <w:top w:type="dxa" w:w="80"/>
+              <w:left w:type="dxa" w:w="120"/>
+              <w:bottom w:type="dxa" w:w="80"/>
+              <w:right w:type="dxa" w:w="120"/>
+            </w:tcMar>
+          </w:tcPr>
+          <w:p>
+            <w:r>
+              <w:rPr>
+                <w:rFonts w:ascii="Arial" w:cs="Arial" w:eastAsia="Arial" w:hAnsi="Arial"/>
+                <w:b w:val="false"/>
+                <w:bCs w:val="false"/>
+                <w:color w:val="333333"/>
+                <w:sz w:val="20"/>
+                <w:szCs w:val="20"/>
+              </w:rPr>
+              <w:t xml:space="preserve">Docker (religioustext-basex, religioustext-mysql)</w:t>
+            </w:r>
+          </w:p>
+        </w:tc>
+      </w:tr>
+      <w:tr>
+        <w:trPr>
+          <w:tblHeader w:val="false"/>
+        </w:trPr>
+        <w:tc>
+          <w:tcPr>
+            <w:tcBorders>
+              <w:top w:val="single" w:color="CCCCCC" w:sz="1"/>
+              <w:left w:val="single" w:color="CCCCCC" w:sz="1"/>
+              <w:bottom w:val="single" w:color="CCCCCC" w:sz="1"/>
+              <w:right w:val="single" w:color="CCCCCC" w:sz="1"/>
+            </w:tcBorders>
+            <w:tcMar>
+              <w:top w:type="dxa" w:w="80"/>
+              <w:left w:type="dxa" w:w="120"/>
+              <w:bottom w:type="dxa" w:w="80"/>
+              <w:right w:type="dxa" w:w="120"/>
+            </w:tcMar>
+          </w:tcPr>
+          <w:p>
+            <w:r>
+              <w:rPr>
+                <w:rFonts w:ascii="Arial" w:cs="Arial" w:eastAsia="Arial" w:hAnsi="Arial"/>
+                <w:b w:val="false"/>
+                <w:bCs w:val="false"/>
+                <w:color w:val="333333"/>
+                <w:sz w:val="20"/>
+                <w:szCs w:val="20"/>
+              </w:rPr>
               <w:t xml:space="preserve">Bible source</w:t>
             </w:r>
           </w:p>
@@ -670,7 +798,356 @@
           <w:sz w:val="26"/>
           <w:szCs w:val="26"/>
         </w:rPr>
-        <w:t xml:space="preserve">1.2 Module Structure</w:t>
+        <w:t xml:space="preserve">1.3 Dual Database Architecture</w:t>
+      </w:r>
+    </w:p>
+    <w:p>
+      <w:pPr>
+        <w:spacing w:after="80" w:before="80"/>
+        <w:jc w:val="both"/>
+      </w:pPr>
+      <w:r>
+        <w:rPr>
+          <w:rFonts w:ascii="Arial" w:cs="Arial" w:eastAsia="Arial" w:hAnsi="Arial"/>
+          <w:sz w:val="22"/>
+          <w:szCs w:val="22"/>
+        </w:rPr>
+        <w:t xml:space="preserve">The platform uses two databases for distinct purposes:</w:t>
+      </w:r>
+    </w:p>
+    <w:tbl>
+      <w:tblPr>
+        <w:tblW w:type="dxa" w:w="9360"/>
+        <w:tblBorders>
+          <w:top w:val="single" w:color="auto" w:sz="4"/>
+          <w:left w:val="single" w:color="auto" w:sz="4"/>
+          <w:bottom w:val="single" w:color="auto" w:sz="4"/>
+          <w:right w:val="single" w:color="auto" w:sz="4"/>
+          <w:insideH w:val="single" w:color="auto" w:sz="4"/>
+          <w:insideV w:val="single" w:color="auto" w:sz="4"/>
+        </w:tblBorders>
+      </w:tblPr>
+      <w:tblGrid>
+        <w:gridCol w:w="2000"/>
+        <w:gridCol w:w="2800"/>
+        <w:gridCol w:w="4560"/>
+      </w:tblGrid>
+      <w:tr>
+        <w:trPr>
+          <w:tblHeader/>
+        </w:trPr>
+        <w:tc>
+          <w:tcPr>
+            <w:tcBorders>
+              <w:top w:val="single" w:color="CCCCCC" w:sz="1"/>
+              <w:left w:val="single" w:color="CCCCCC" w:sz="1"/>
+              <w:bottom w:val="single" w:color="CCCCCC" w:sz="1"/>
+              <w:right w:val="single" w:color="CCCCCC" w:sz="1"/>
+            </w:tcBorders>
+            <w:shd w:fill="1a3a5c" w:val="clear"/>
+            <w:tcMar>
+              <w:top w:type="dxa" w:w="80"/>
+              <w:left w:type="dxa" w:w="120"/>
+              <w:bottom w:type="dxa" w:w="80"/>
+              <w:right w:type="dxa" w:w="120"/>
+            </w:tcMar>
+          </w:tcPr>
+          <w:p>
+            <w:r>
+              <w:rPr>
+                <w:rFonts w:ascii="Arial" w:cs="Arial" w:eastAsia="Arial" w:hAnsi="Arial"/>
+                <w:b/>
+                <w:bCs/>
+                <w:color w:val="FFFFFF"/>
+                <w:sz w:val="20"/>
+                <w:szCs w:val="20"/>
+              </w:rPr>
+              <w:t xml:space="preserve">Database</w:t>
+            </w:r>
+          </w:p>
+        </w:tc>
+        <w:tc>
+          <w:tcPr>
+            <w:tcBorders>
+              <w:top w:val="single" w:color="CCCCCC" w:sz="1"/>
+              <w:left w:val="single" w:color="CCCCCC" w:sz="1"/>
+              <w:bottom w:val="single" w:color="CCCCCC" w:sz="1"/>
+              <w:right w:val="single" w:color="CCCCCC" w:sz="1"/>
+            </w:tcBorders>
+            <w:shd w:fill="1a3a5c" w:val="clear"/>
+            <w:tcMar>
+              <w:top w:type="dxa" w:w="80"/>
+              <w:left w:type="dxa" w:w="120"/>
+              <w:bottom w:type="dxa" w:w="80"/>
+              <w:right w:type="dxa" w:w="120"/>
+            </w:tcMar>
+          </w:tcPr>
+          <w:p>
+            <w:r>
+              <w:rPr>
+                <w:rFonts w:ascii="Arial" w:cs="Arial" w:eastAsia="Arial" w:hAnsi="Arial"/>
+                <w:b/>
+                <w:bCs/>
+                <w:color w:val="FFFFFF"/>
+                <w:sz w:val="20"/>
+                <w:szCs w:val="20"/>
+              </w:rPr>
+              <w:t xml:space="preserve">Technology</w:t>
+            </w:r>
+          </w:p>
+        </w:tc>
+        <w:tc>
+          <w:tcPr>
+            <w:tcBorders>
+              <w:top w:val="single" w:color="CCCCCC" w:sz="1"/>
+              <w:left w:val="single" w:color="CCCCCC" w:sz="1"/>
+              <w:bottom w:val="single" w:color="CCCCCC" w:sz="1"/>
+              <w:right w:val="single" w:color="CCCCCC" w:sz="1"/>
+            </w:tcBorders>
+            <w:shd w:fill="1a3a5c" w:val="clear"/>
+            <w:tcMar>
+              <w:top w:type="dxa" w:w="80"/>
+              <w:left w:type="dxa" w:w="120"/>
+              <w:bottom w:type="dxa" w:w="80"/>
+              <w:right w:type="dxa" w:w="120"/>
+            </w:tcMar>
+          </w:tcPr>
+          <w:p>
+            <w:r>
+              <w:rPr>
+                <w:rFonts w:ascii="Arial" w:cs="Arial" w:eastAsia="Arial" w:hAnsi="Arial"/>
+                <w:b/>
+                <w:bCs/>
+                <w:color w:val="FFFFFF"/>
+                <w:sz w:val="20"/>
+                <w:szCs w:val="20"/>
+              </w:rPr>
+              <w:t xml:space="preserve">Purpose</w:t>
+            </w:r>
+          </w:p>
+        </w:tc>
+      </w:tr>
+      <w:tr>
+        <w:trPr>
+          <w:tblHeader w:val="false"/>
+        </w:trPr>
+        <w:tc>
+          <w:tcPr>
+            <w:tcBorders>
+              <w:top w:val="single" w:color="CCCCCC" w:sz="1"/>
+              <w:left w:val="single" w:color="CCCCCC" w:sz="1"/>
+              <w:bottom w:val="single" w:color="CCCCCC" w:sz="1"/>
+              <w:right w:val="single" w:color="CCCCCC" w:sz="1"/>
+            </w:tcBorders>
+            <w:tcMar>
+              <w:top w:type="dxa" w:w="80"/>
+              <w:left w:type="dxa" w:w="120"/>
+              <w:bottom w:type="dxa" w:w="80"/>
+              <w:right w:type="dxa" w:w="120"/>
+            </w:tcMar>
+          </w:tcPr>
+          <w:p>
+            <w:r>
+              <w:rPr>
+                <w:rFonts w:ascii="Arial" w:cs="Arial" w:eastAsia="Arial" w:hAnsi="Arial"/>
+                <w:b w:val="false"/>
+                <w:bCs w:val="false"/>
+                <w:color w:val="333333"/>
+                <w:sz w:val="20"/>
+                <w:szCs w:val="20"/>
+              </w:rPr>
+              <w:t xml:space="preserve">religioustext-basex</w:t>
+            </w:r>
+          </w:p>
+        </w:tc>
+        <w:tc>
+          <w:tcPr>
+            <w:tcBorders>
+              <w:top w:val="single" w:color="CCCCCC" w:sz="1"/>
+              <w:left w:val="single" w:color="CCCCCC" w:sz="1"/>
+              <w:bottom w:val="single" w:color="CCCCCC" w:sz="1"/>
+              <w:right w:val="single" w:color="CCCCCC" w:sz="1"/>
+            </w:tcBorders>
+            <w:shd w:fill="f5f8fb" w:val="clear"/>
+            <w:tcMar>
+              <w:top w:type="dxa" w:w="80"/>
+              <w:left w:type="dxa" w:w="120"/>
+              <w:bottom w:type="dxa" w:w="80"/>
+              <w:right w:type="dxa" w:w="120"/>
+            </w:tcMar>
+          </w:tcPr>
+          <w:p>
+            <w:r>
+              <w:rPr>
+                <w:rFonts w:ascii="Arial" w:cs="Arial" w:eastAsia="Arial" w:hAnsi="Arial"/>
+                <w:b w:val="false"/>
+                <w:bCs w:val="false"/>
+                <w:color w:val="333333"/>
+                <w:sz w:val="20"/>
+                <w:szCs w:val="20"/>
+              </w:rPr>
+              <w:t xml:space="preserve">BaseX 10 (XML)</w:t>
+            </w:r>
+          </w:p>
+        </w:tc>
+        <w:tc>
+          <w:tcPr>
+            <w:tcBorders>
+              <w:top w:val="single" w:color="CCCCCC" w:sz="1"/>
+              <w:left w:val="single" w:color="CCCCCC" w:sz="1"/>
+              <w:bottom w:val="single" w:color="CCCCCC" w:sz="1"/>
+              <w:right w:val="single" w:color="CCCCCC" w:sz="1"/>
+            </w:tcBorders>
+            <w:tcMar>
+              <w:top w:type="dxa" w:w="80"/>
+              <w:left w:type="dxa" w:w="120"/>
+              <w:bottom w:type="dxa" w:w="80"/>
+              <w:right w:type="dxa" w:w="120"/>
+            </w:tcMar>
+          </w:tcPr>
+          <w:p>
+            <w:r>
+              <w:rPr>
+                <w:rFonts w:ascii="Arial" w:cs="Arial" w:eastAsia="Arial" w:hAnsi="Arial"/>
+                <w:b w:val="false"/>
+                <w:bCs w:val="false"/>
+                <w:color w:val="333333"/>
+                <w:sz w:val="20"/>
+                <w:szCs w:val="20"/>
+              </w:rPr>
+              <w:t xml:space="preserve">All religious texts — Bible, Quran, Hadith. Read-heavy, complex XQuery, native XML storage.</w:t>
+            </w:r>
+          </w:p>
+        </w:tc>
+      </w:tr>
+      <w:tr>
+        <w:trPr>
+          <w:tblHeader w:val="false"/>
+        </w:trPr>
+        <w:tc>
+          <w:tcPr>
+            <w:tcBorders>
+              <w:top w:val="single" w:color="CCCCCC" w:sz="1"/>
+              <w:left w:val="single" w:color="CCCCCC" w:sz="1"/>
+              <w:bottom w:val="single" w:color="CCCCCC" w:sz="1"/>
+              <w:right w:val="single" w:color="CCCCCC" w:sz="1"/>
+            </w:tcBorders>
+            <w:tcMar>
+              <w:top w:type="dxa" w:w="80"/>
+              <w:left w:type="dxa" w:w="120"/>
+              <w:bottom w:type="dxa" w:w="80"/>
+              <w:right w:type="dxa" w:w="120"/>
+            </w:tcMar>
+          </w:tcPr>
+          <w:p>
+            <w:r>
+              <w:rPr>
+                <w:rFonts w:ascii="Arial" w:cs="Arial" w:eastAsia="Arial" w:hAnsi="Arial"/>
+                <w:b w:val="false"/>
+                <w:bCs w:val="false"/>
+                <w:color w:val="333333"/>
+                <w:sz w:val="20"/>
+                <w:szCs w:val="20"/>
+              </w:rPr>
+              <w:t xml:space="preserve">religioustext-mysql</w:t>
+            </w:r>
+          </w:p>
+        </w:tc>
+        <w:tc>
+          <w:tcPr>
+            <w:tcBorders>
+              <w:top w:val="single" w:color="CCCCCC" w:sz="1"/>
+              <w:left w:val="single" w:color="CCCCCC" w:sz="1"/>
+              <w:bottom w:val="single" w:color="CCCCCC" w:sz="1"/>
+              <w:right w:val="single" w:color="CCCCCC" w:sz="1"/>
+            </w:tcBorders>
+            <w:shd w:fill="f5f8fb" w:val="clear"/>
+            <w:tcMar>
+              <w:top w:type="dxa" w:w="80"/>
+              <w:left w:type="dxa" w:w="120"/>
+              <w:bottom w:type="dxa" w:w="80"/>
+              <w:right w:type="dxa" w:w="120"/>
+            </w:tcMar>
+          </w:tcPr>
+          <w:p>
+            <w:r>
+              <w:rPr>
+                <w:rFonts w:ascii="Arial" w:cs="Arial" w:eastAsia="Arial" w:hAnsi="Arial"/>
+                <w:b w:val="false"/>
+                <w:bCs w:val="false"/>
+                <w:color w:val="333333"/>
+                <w:sz w:val="20"/>
+                <w:szCs w:val="20"/>
+              </w:rPr>
+              <w:t xml:space="preserve">MySQL 8.3</w:t>
+            </w:r>
+          </w:p>
+        </w:tc>
+        <w:tc>
+          <w:tcPr>
+            <w:tcBorders>
+              <w:top w:val="single" w:color="CCCCCC" w:sz="1"/>
+              <w:left w:val="single" w:color="CCCCCC" w:sz="1"/>
+              <w:bottom w:val="single" w:color="CCCCCC" w:sz="1"/>
+              <w:right w:val="single" w:color="CCCCCC" w:sz="1"/>
+            </w:tcBorders>
+            <w:tcMar>
+              <w:top w:type="dxa" w:w="80"/>
+              <w:left w:type="dxa" w:w="120"/>
+              <w:bottom w:type="dxa" w:w="80"/>
+              <w:right w:type="dxa" w:w="120"/>
+            </w:tcMar>
+          </w:tcPr>
+          <w:p>
+            <w:r>
+              <w:rPr>
+                <w:rFonts w:ascii="Arial" w:cs="Arial" w:eastAsia="Arial" w:hAnsi="Arial"/>
+                <w:b w:val="false"/>
+                <w:bCs w:val="false"/>
+                <w:color w:val="333333"/>
+                <w:sz w:val="20"/>
+                <w:szCs w:val="20"/>
+              </w:rPr>
+              <w:t xml:space="preserve">Users, comments, personal notes, sessions. Relational, write-heavy, Spring Security integration.</w:t>
+            </w:r>
+          </w:p>
+        </w:tc>
+      </w:tr>
+    </w:tbl>
+    <w:p>
+      <w:pPr>
+        <w:spacing w:before="240"/>
+      </w:pPr>
+    </w:p>
+    <w:p>
+      <w:pPr>
+        <w:spacing w:after="80" w:before="80"/>
+        <w:jc w:val="both"/>
+      </w:pPr>
+      <w:r>
+        <w:rPr>
+          <w:rFonts w:ascii="Arial" w:cs="Arial" w:eastAsia="Arial" w:hAnsi="Arial"/>
+          <w:sz w:val="22"/>
+          <w:szCs w:val="22"/>
+        </w:rPr>
+        <w:t xml:space="preserve">Both databases run in Docker and are defined in docker/. BaseX is accessed via its REST API using XQuery over HTTP. MySQL is accessed via Spring Data JPA.</w:t>
+      </w:r>
+    </w:p>
+    <w:p>
+      <w:pPr>
+        <w:pStyle w:val="Heading2"/>
+        <w:spacing w:after="120" w:before="240"/>
+      </w:pPr>
+      <w:r>
+        <w:rPr>
+          <w:rFonts w:ascii="Arial" w:cs="Arial" w:eastAsia="Arial" w:hAnsi="Arial"/>
+          <w:b/>
+          <w:bCs/>
+          <w:color w:val="2e6da4"/>
+          <w:sz w:val="26"/>
+          <w:szCs w:val="26"/>
+        </w:rPr>
+        <w:t xml:space="preserve">1.4 Module Structure</w:t>
       </w:r>
     </w:p>
     <w:p>
@@ -750,7 +1227,7 @@
           <w:sz w:val="22"/>
           <w:szCs w:val="22"/>
         </w:rPr>
-        <w:t xml:space="preserve">docker/ — Docker configuration for BaseX</w:t>
+        <w:t xml:space="preserve">docker/ — Docker configuration for BaseX (port 8984) and MySQL 8.3 (port 3306)</w:t>
       </w:r>
     </w:p>
     <w:p>

</xml_diff>